<commit_message>
Refactor project structure and decision points for SysML v2/KerML integration
- Updated the project point of graft to use `SysMLProject` instead of `KerMLProject`, aligning with UML conventions.
- Introduced a new document outlining key decision points regarding the grafting of SysML v2/KerML onto the Modelio infrastructure, detailing propositions and questions for arbitration.
- Defined the graft point on the infrastructure as `ModelElement`, renaming `KerML::Element` to `KerMLModelElement`.
- Established mappings for overlapping concepts between KerML and Modelio infrastructure, ensuring no duplication of existing functionalities.
- Proposed a general strategy for handling multiple inheritance from KerML to Java, emphasizing delegation patterns.
- Summarized 34 individual resolutions for classes with multiple inheritance, detailing their primary and delegated axes.
- Outlined the next steps for automating the transformation from `reference` to `implementation` using a Jython script.
</commit_message>
<xml_diff>
--- a/SemGen_Outil.docx
+++ b/SemGen_Outil.docx
@@ -541,7 +541,7 @@
         <w:spacing w:after="80"/>
       </w:pPr>
       <w:r>
-        <w:t xml:space="preserve">Metamodel.isExtension — case à cocher dont le rôle précis reste à confirmer [à vérifier] ; convention observée : cochée par défaut sur le métamodèle de démonstration.</w:t>
+        <w:t xml:space="preserve">Metamodel.isExtension — à cocher systématiquement (confirmé par Cédric Marin) sur tout métamodèle destiné à SemGen.</w:t>
       </w:r>
     </w:p>
     <w:p>
@@ -1303,7 +1303,7 @@
           <w:sz w:val="20"/>
           <w:szCs w:val="20"/>
         </w:rPr>
-        <w:t xml:space="preserve">Deux propriétés historiques apparaissent aussi dans le groupe SemGen d'un attribut sémantique : « fpIndexed » (obsolète — indexation spécifique héritée d'anciennes versions du moteur de persistance ; à ignorer) et « EInoExternalize » (exclusion d'un mécanisme d'externalisation [à vérifier le comportement exact]).</w:t>
+        <w:t xml:space="preserve">Deux propriétés historiques apparaissent aussi dans le groupe SemGen d'un attribut sémantique, toutes deux confirmées par Cédric Marin comme n'étant plus prises en compte par le moteur de génération actuel : « fpIndexed » (signifiait l'ajout d'un index sur cet attribut — désactivé aujourd'hui, ce qui peut être dommage) et « EInoExternalize » (signifiait « transient », c'est-à-dire non persisté — à ne jamais cocher, cette exclusion n'étant plus honorée par le moteur).</w:t>
       </w:r>
     </w:p>
     <w:p>
@@ -1444,6 +1444,25 @@
     </w:p>
     <w:p>
       <w:pPr>
+        <w:pBdr>
+          <w:left w:val="single" w:color="2E74B5" w:sz="6" w:space="8"/>
+        </w:pBdr>
+        <w:spacing w:after="160"/>
+        <w:ind w:left="200"/>
+      </w:pPr>
+      <w:r>
+        <w:rPr>
+          <w:i/>
+          <w:iCs/>
+          <w:color w:val="666666"/>
+          <w:sz w:val="20"/>
+          <w:szCs w:val="20"/>
+        </w:rPr>
+        <w:t xml:space="preserve">Précision de Cédric Marin : cocher structural.partOf est optionnel pour les relations d'agrégation et de composition — le sens principal y est alors implicite, porté nativement par la sémantique de la relation. La propriété n'a réellement besoin d'être renseignée explicitement que pour les associations pures (voir le document compagnon, §6.3).</w:t>
+      </w:r>
+    </w:p>
+    <w:p>
+      <w:pPr>
         <w:pStyle w:val="Heading2"/>
         <w:spacing w:after="150" w:before="300"/>
       </w:pPr>
@@ -1461,6 +1480,25 @@
     </w:p>
     <w:p>
       <w:pPr>
+        <w:pBdr>
+          <w:left w:val="single" w:color="2E74B5" w:sz="6" w:space="8"/>
+        </w:pBdr>
+        <w:spacing w:after="160"/>
+        <w:ind w:left="200"/>
+      </w:pPr>
+      <w:r>
+        <w:rPr>
+          <w:i/>
+          <w:iCs/>
+          <w:color w:val="666666"/>
+          <w:sz w:val="20"/>
+          <w:szCs w:val="20"/>
+        </w:rPr>
+        <w:t xml:space="preserve">Pour les relations d'agrégation et de composition, ce comportement est implicite : structural.isToDelete n'a pas besoin d'être coché. La propriété devient pertinente à renseigner explicitement surtout pour les associations pures.</w:t>
+      </w:r>
+    </w:p>
+    <w:p>
+      <w:pPr>
         <w:spacing w:after="160"/>
       </w:pPr>
       <w:r>
@@ -1481,7 +1519,7 @@
         <w:spacing w:after="160"/>
       </w:pPr>
       <w:r>
-        <w:t xml:space="preserve">Par défaut, un lien (métaclasse SemanticLinkMetaclass) appartient toujours, par composition, à son élément source. Les rôles « Semantic.link.source » et « Semantic.link.target » (groupe SemGen de l'AssociationEnd) indiquent explicitement quel rôle joue la source et quel rôle joue la cible d'un lien sémantique — indépendamment du sens de la composition.</w:t>
+        <w:t xml:space="preserve">Par convention de modélisation, un lien (métaclasse SemanticLinkMetaclass) sera modélisé comme appartenant par composition à sa source — il existe cependant des exceptions (exemple cité par Cédric Marin : « DataFlow »). Les rôles « Semantic.link.source » et « Semantic.link.target » (groupe SemGen de l'AssociationEnd) indiquent explicitement quel rôle joue la source et quel rôle joue la cible d'un lien sémantique — indépendamment du sens de la composition.</w:t>
       </w:r>
     </w:p>
     <w:p>
@@ -1498,7 +1536,7 @@
         <w:spacing w:after="200" w:before="400"/>
       </w:pPr>
       <w:r>
-        <w:t xml:space="preserve">6. Impact des propriétés SemGen sur le code Java généré</w:t>
+        <w:t xml:space="preserve">6. Impact des propriétés SemGen sur le code généré et la persistance</w:t>
       </w:r>
     </w:p>
     <w:p>
@@ -1506,7 +1544,7 @@
         <w:spacing w:after="160"/>
       </w:pPr>
       <w:r>
-        <w:t xml:space="preserve">Cette section rassemble, à titre de synthèse, la correspondance entre les propriétés SemGen décrites dans ce document et leur traduction attendue dans le code Java généré (mm.api / mm.impl).</w:t>
+        <w:t xml:space="preserve">Cette section rassemble, à titre de synthèse, la correspondance entre les propriétés SemGen décrites dans ce document et leur effet réel sur le code généré (mm.api / mm.impl) et sur la persistance. Point de vigilance confirmé par Cédric Marin en relecture : la classe et l'API Java d'une métaclasse sont toujours générées, quelle que soit la valeur de ses propriétés SemGen — ce que ces propriétés déterminent, c'est le mode de persistance et de stockage, pas l'existence même du code généré.</w:t>
       </w:r>
     </w:p>
     <w:tbl>
@@ -1573,7 +1611,7 @@
                 <w:sz w:val="20"/>
                 <w:szCs w:val="20"/>
               </w:rPr>
-              <w:t xml:space="preserve">Effet attendu sur le code Java généré</w:t>
+              <w:t xml:space="preserve">Effet réel</w:t>
             </w:r>
           </w:p>
         </w:tc>
@@ -1640,7 +1678,7 @@
                 <w:sz w:val="20"/>
                 <w:szCs w:val="20"/>
               </w:rPr>
-              <w:t xml:space="preserve">Génère une classe Java complète avec sa propre unité de persistance (fichier dédié) et son API associée.</w:t>
+              <w:t xml:space="preserve">L'instance est sauvegardée dans sa propre unité de persistance (fichier dédié), avec sa granularité Teamwork propre. La classe et l'API Java sont générées dans tous les cas.</w:t>
             </w:r>
           </w:p>
         </w:tc>
@@ -1704,7 +1742,7 @@
                 <w:sz w:val="20"/>
                 <w:szCs w:val="20"/>
               </w:rPr>
-              <w:t xml:space="preserve">Le champ Java correspondant est porté par la classe de l'élément parent, sans classe de persistance séparée.</w:t>
+              <w:t xml:space="preserve">L'instance est sauvegardée avec son élément parent, dans la même unité de persistance (pas de fichier séparé). La classe Java correspondante est générée normalement.</w:t>
             </w:r>
           </w:p>
         </w:tc>
@@ -1767,7 +1805,7 @@
                 <w:sz w:val="20"/>
                 <w:szCs w:val="20"/>
               </w:rPr>
-              <w:t xml:space="preserve">Autorise la génération d'une classe Java pouvant exister sans référence à un parent de composition (racine).</w:t>
+              <w:t xml:space="preserve">Autorise une instance à exister sans parent de composition (cas des racines de métamodèle) ; sans cette propriété, l'API générée impose la présence d'un parent.</w:t>
             </w:r>
           </w:p>
         </w:tc>
@@ -1958,7 +1996,7 @@
                 <w:sz w:val="20"/>
                 <w:szCs w:val="20"/>
               </w:rPr>
-              <w:t xml:space="preserve">Détermine la classe Java qui porte physiquement le champ de la relation (stockage).</w:t>
+              <w:t xml:space="preserve">Détermine la classe Java qui porte physiquement le champ de la relation (stockage). Optionnel pour les compositions et agrégations (le sens principal y est implicite) ; à renseigner explicitement pour les associations pures.</w:t>
             </w:r>
           </w:p>
         </w:tc>
@@ -2021,7 +2059,7 @@
                 <w:sz w:val="20"/>
                 <w:szCs w:val="20"/>
               </w:rPr>
-              <w:t xml:space="preserve">Déclenche la suppression en cascade de l'élément lié, même hors composition.</w:t>
+              <w:t xml:space="preserve">Déclenche la suppression en cascade de l'élément lié. Implicite pour les compositions et agrégations (pas besoin d'être coché) ; pertinent surtout pour les associations pures.</w:t>
             </w:r>
           </w:p>
         </w:tc>
@@ -2148,7 +2186,7 @@
                 <w:sz w:val="20"/>
                 <w:szCs w:val="20"/>
               </w:rPr>
-              <w:t xml:space="preserve">Détermine, pour une métaclasse de lien, quel(s) rôle(s) génèrent l'accès Java à la source / à la cible du lien.</w:t>
+              <w:t xml:space="preserve">Détermine, pour une métaclasse de lien, quel(s) rôle(s) donnent accès en Java à la source / à la cible du lien.</w:t>
             </w:r>
           </w:p>
         </w:tc>
@@ -2191,6 +2229,70 @@
                 <w:sz w:val="20"/>
                 <w:szCs w:val="20"/>
               </w:rPr>
+              <w:t xml:space="preserve">Metamodel.isExtension (SemGen::Metamodel)</w:t>
+            </w:r>
+          </w:p>
+        </w:tc>
+        <w:tc>
+          <w:tcPr>
+            <w:tcW w:type="dxa" w:w="3000"/>
+            <w:shd w:fill="DEEAF6" w:color="DEEAF6" w:val="clear"/>
+            <w:tcMar>
+              <w:top w:type="dxa" w:w="80"/>
+              <w:left w:type="dxa" w:w="100"/>
+              <w:bottom w:type="dxa" w:w="80"/>
+              <w:right w:type="dxa" w:w="100"/>
+            </w:tcMar>
+          </w:tcPr>
+          <w:p>
+            <w:r>
+              <w:rPr>
+                <w:sz w:val="20"/>
+                <w:szCs w:val="20"/>
+              </w:rPr>
+              <w:t xml:space="preserve">À cocher systématiquement sur tout métamodèle destiné à SemGen.</w:t>
+            </w:r>
+          </w:p>
+        </w:tc>
+        <w:tc>
+          <w:tcPr>
+            <w:tcW w:type="dxa" w:w="3000"/>
+            <w:shd w:fill="DEEAF6" w:color="DEEAF6" w:val="clear"/>
+            <w:tcMar>
+              <w:top w:type="dxa" w:w="80"/>
+              <w:left w:type="dxa" w:w="100"/>
+              <w:bottom w:type="dxa" w:w="80"/>
+              <w:right w:type="dxa" w:w="100"/>
+            </w:tcMar>
+          </w:tcPr>
+          <w:p>
+            <w:r>
+              <w:rPr>
+                <w:sz w:val="20"/>
+                <w:szCs w:val="20"/>
+              </w:rPr>
+              <w:t xml:space="preserve">§2</w:t>
+            </w:r>
+          </w:p>
+        </w:tc>
+      </w:tr>
+      <w:tr>
+        <w:tc>
+          <w:tcPr>
+            <w:tcW w:type="dxa" w:w="3000"/>
+            <w:tcMar>
+              <w:top w:type="dxa" w:w="80"/>
+              <w:left w:type="dxa" w:w="100"/>
+              <w:bottom w:type="dxa" w:w="80"/>
+              <w:right w:type="dxa" w:w="100"/>
+            </w:tcMar>
+          </w:tcPr>
+          <w:p>
+            <w:r>
+              <w:rPr>
+                <w:sz w:val="20"/>
+                <w:szCs w:val="20"/>
+              </w:rPr>
               <w:t xml:space="preserve">Version / Production namespace (SemGen::Metamodel)</w:t>
             </w:r>
           </w:p>
@@ -2198,7 +2300,6 @@
         <w:tc>
           <w:tcPr>
             <w:tcW w:type="dxa" w:w="3000"/>
-            <w:shd w:fill="DEEAF6" w:color="DEEAF6" w:val="clear"/>
             <w:tcMar>
               <w:top w:type="dxa" w:w="80"/>
               <w:left w:type="dxa" w:w="100"/>
@@ -2219,7 +2320,6 @@
         <w:tc>
           <w:tcPr>
             <w:tcW w:type="dxa" w:w="3000"/>
-            <w:shd w:fill="DEEAF6" w:color="DEEAF6" w:val="clear"/>
             <w:tcMar>
               <w:top w:type="dxa" w:w="80"/>
               <w:left w:type="dxa" w:w="100"/>
@@ -2255,7 +2355,7 @@
           <w:sz w:val="20"/>
           <w:szCs w:val="20"/>
         </w:rPr>
-        <w:t xml:space="preserve">Recommandation pour toute équipe modélisant un métamodèle destiné à SemGen (SysML v2 compris) : lors de la relecture de chaque métaclasse, vérifier systématiquement que la propriété posée dans Modelio produit bien l'effet Java attendu ci-dessus — en cas de doute, valider directement avec Cédric Marin plutôt que de supposer le comportement de génération.</w:t>
+        <w:t xml:space="preserve">Recommandation pour toute équipe modélisant un métamodèle destiné à SemGen (SysML v2 compris) : lors de la relecture de chaque métaclasse, vérifier systématiquement que la propriété posée dans Modelio produit bien l'effet attendu ci-dessus — en cas de doute, valider directement avec Cédric Marin plutôt que de supposer le comportement de génération.</w:t>
       </w:r>
     </w:p>
     <w:p>
@@ -2674,7 +2774,7 @@
                 <w:sz w:val="20"/>
                 <w:szCs w:val="20"/>
               </w:rPr>
-              <w:t xml:space="preserve">Propriété SemGen posée sur un rôle d'association, indiquant le sens principal (côté où l'information est physiquement stockée).</w:t>
+              <w:t xml:space="preserve">Propriété SemGen posée sur un rôle d'association, indiquant le sens principal (côté où l'information est physiquement stockée) ; optionnelle pour les compositions et agrégations, où ce sens est implicite — à renseigner surtout pour les associations pures.</w:t>
             </w:r>
           </w:p>
         </w:tc>
@@ -2716,7 +2816,7 @@
                 <w:sz w:val="20"/>
                 <w:szCs w:val="20"/>
               </w:rPr>
-              <w:t xml:space="preserve">Propriété SemGen indiquant qu'à la suppression d'un élément, l'élément lié à l'autre bout doit aussi être supprimé.</w:t>
+              <w:t xml:space="preserve">Propriété SemGen indiquant qu'à la suppression d'un élément, l'élément lié à l'autre bout doit aussi être supprimé ; implicite pour les compositions et agrégations, pertinente surtout pour les associations pures.</w:t>
             </w:r>
           </w:p>
         </w:tc>
@@ -2888,7 +2988,7 @@
                 <w:sz w:val="20"/>
                 <w:szCs w:val="20"/>
               </w:rPr>
-              <w:t xml:space="preserve">Propriété SemGen obsolète sur un attribut (ancienne indexation) ; sans effet aujourd'hui.</w:t>
+              <w:t xml:space="preserve">Propriété SemGen historique sur un attribut, signifiant l'ajout d'un index sur cet attribut ; n'est plus prise en compte par le moteur de génération actuel.</w:t>
             </w:r>
           </w:p>
         </w:tc>
@@ -2932,7 +3032,7 @@
                 <w:sz w:val="20"/>
                 <w:szCs w:val="20"/>
               </w:rPr>
-              <w:t xml:space="preserve">Propriété SemGen sur un attribut, dont le comportement exact reste à confirmer [à vérifier].</w:t>
+              <w:t xml:space="preserve">Propriété SemGen historique sur un attribut, signifiant « transient » (non persisté) ; à ne jamais cocher — n'est plus honorée par le moteur de génération actuel.</w:t>
             </w:r>
           </w:p>
         </w:tc>
@@ -3445,4 +3545,271 @@
     </w:rPr>
   </w:style>
 </w:styles>
+</file>
+
+<file path=customXml/item1.xml><?xml version="1.0" encoding="utf-8"?>
+<ct:contentTypeSchema xmlns:ct="http://schemas.microsoft.com/office/2006/metadata/contentType" xmlns:ma="http://schemas.microsoft.com/office/2006/metadata/properties/metaAttributes" ct:_="" ma:_="" ma:contentTypeName="Document" ma:contentTypeID="0x01010014E17BA170FBE643AF11AB0DACD7748A" ma:contentTypeVersion="15" ma:contentTypeDescription="Crée un document." ma:contentTypeScope="" ma:versionID="af30a35b1df040ece125c273cee6ce8d">
+  <xsd:schema xmlns:xsd="http://www.w3.org/2001/XMLSchema" xmlns:xs="http://www.w3.org/2001/XMLSchema" xmlns:p="http://schemas.microsoft.com/office/2006/metadata/properties" xmlns:ns2="c510b244-4fa2-452b-9372-08ea733f7cc3" xmlns:ns3="f1092801-e348-4c00-9058-ba7b1fb55286" targetNamespace="http://schemas.microsoft.com/office/2006/metadata/properties" ma:root="true" ma:fieldsID="fbe8f0908ca8de68bc24876b9e235688" ns2:_="" ns3:_="">
+    <xsd:import namespace="c510b244-4fa2-452b-9372-08ea733f7cc3"/>
+    <xsd:import namespace="f1092801-e348-4c00-9058-ba7b1fb55286"/>
+    <xsd:element name="properties">
+      <xsd:complexType>
+        <xsd:sequence>
+          <xsd:element name="documentManagement">
+            <xsd:complexType>
+              <xsd:all>
+                <xsd:element ref="ns2:lcf76f155ced4ddcb4097134ff3c332f" minOccurs="0"/>
+                <xsd:element ref="ns3:TaxCatchAll" minOccurs="0"/>
+                <xsd:element ref="ns2:MediaServiceMetadata" minOccurs="0"/>
+                <xsd:element ref="ns2:MediaServiceFastMetadata" minOccurs="0"/>
+                <xsd:element ref="ns2:MediaServiceOCR" minOccurs="0"/>
+                <xsd:element ref="ns2:MediaServiceGenerationTime" minOccurs="0"/>
+                <xsd:element ref="ns2:MediaServiceEventHashCode" minOccurs="0"/>
+                <xsd:element ref="ns2:MediaServiceDateTaken" minOccurs="0"/>
+                <xsd:element ref="ns2:MediaLengthInSeconds" minOccurs="0"/>
+                <xsd:element ref="ns3:SharedWithUsers" minOccurs="0"/>
+                <xsd:element ref="ns3:SharedWithDetails" minOccurs="0"/>
+                <xsd:element ref="ns2:MediaServiceObjectDetectorVersions" minOccurs="0"/>
+                <xsd:element ref="ns2:MediaServiceLocation" minOccurs="0"/>
+                <xsd:element ref="ns2:MediaServiceSearchProperties" minOccurs="0"/>
+              </xsd:all>
+            </xsd:complexType>
+          </xsd:element>
+        </xsd:sequence>
+      </xsd:complexType>
+    </xsd:element>
+  </xsd:schema>
+  <xsd:schema xmlns:xsd="http://www.w3.org/2001/XMLSchema" xmlns:xs="http://www.w3.org/2001/XMLSchema" xmlns:dms="http://schemas.microsoft.com/office/2006/documentManagement/types" xmlns:pc="http://schemas.microsoft.com/office/infopath/2007/PartnerControls" targetNamespace="c510b244-4fa2-452b-9372-08ea733f7cc3" elementFormDefault="qualified">
+    <xsd:import namespace="http://schemas.microsoft.com/office/2006/documentManagement/types"/>
+    <xsd:import namespace="http://schemas.microsoft.com/office/infopath/2007/PartnerControls"/>
+    <xsd:element name="lcf76f155ced4ddcb4097134ff3c332f" ma:index="9" nillable="true" ma:taxonomy="true" ma:internalName="lcf76f155ced4ddcb4097134ff3c332f" ma:taxonomyFieldName="MediaServiceImageTags" ma:displayName="Balises d’images" ma:readOnly="false" ma:fieldId="{5cf76f15-5ced-4ddc-b409-7134ff3c332f}" ma:taxonomyMulti="true" ma:sspId="63e13a61-b2c7-4246-b1e6-f08b241a42b3" ma:termSetId="09814cd3-568e-fe90-9814-8d621ff8fb84" ma:anchorId="fba54fb3-c3e1-fe81-a776-ca4b69148c4d" ma:open="true" ma:isKeyword="false">
+      <xsd:complexType>
+        <xsd:sequence>
+          <xsd:element ref="pc:Terms" minOccurs="0" maxOccurs="1"/>
+        </xsd:sequence>
+      </xsd:complexType>
+    </xsd:element>
+    <xsd:element name="MediaServiceMetadata" ma:index="11" nillable="true" ma:displayName="MediaServiceMetadata" ma:hidden="true" ma:internalName="MediaServiceMetadata" ma:readOnly="true">
+      <xsd:simpleType>
+        <xsd:restriction base="dms:Note"/>
+      </xsd:simpleType>
+    </xsd:element>
+    <xsd:element name="MediaServiceFastMetadata" ma:index="12" nillable="true" ma:displayName="MediaServiceFastMetadata" ma:hidden="true" ma:internalName="MediaServiceFastMetadata" ma:readOnly="true">
+      <xsd:simpleType>
+        <xsd:restriction base="dms:Note"/>
+      </xsd:simpleType>
+    </xsd:element>
+    <xsd:element name="MediaServiceOCR" ma:index="13" nillable="true" ma:displayName="Extracted Text" ma:internalName="MediaServiceOCR" ma:readOnly="true">
+      <xsd:simpleType>
+        <xsd:restriction base="dms:Note">
+          <xsd:maxLength value="255"/>
+        </xsd:restriction>
+      </xsd:simpleType>
+    </xsd:element>
+    <xsd:element name="MediaServiceGenerationTime" ma:index="14" nillable="true" ma:displayName="MediaServiceGenerationTime" ma:hidden="true" ma:internalName="MediaServiceGenerationTime" ma:readOnly="true">
+      <xsd:simpleType>
+        <xsd:restriction base="dms:Text"/>
+      </xsd:simpleType>
+    </xsd:element>
+    <xsd:element name="MediaServiceEventHashCode" ma:index="15" nillable="true" ma:displayName="MediaServiceEventHashCode" ma:hidden="true" ma:internalName="MediaServiceEventHashCode" ma:readOnly="true">
+      <xsd:simpleType>
+        <xsd:restriction base="dms:Text"/>
+      </xsd:simpleType>
+    </xsd:element>
+    <xsd:element name="MediaServiceDateTaken" ma:index="16" nillable="true" ma:displayName="MediaServiceDateTaken" ma:hidden="true" ma:indexed="true" ma:internalName="MediaServiceDateTaken" ma:readOnly="true">
+      <xsd:simpleType>
+        <xsd:restriction base="dms:Text"/>
+      </xsd:simpleType>
+    </xsd:element>
+    <xsd:element name="MediaLengthInSeconds" ma:index="17" nillable="true" ma:displayName="MediaLengthInSeconds" ma:hidden="true" ma:internalName="MediaLengthInSeconds" ma:readOnly="true">
+      <xsd:simpleType>
+        <xsd:restriction base="dms:Unknown"/>
+      </xsd:simpleType>
+    </xsd:element>
+    <xsd:element name="MediaServiceObjectDetectorVersions" ma:index="20" nillable="true" ma:displayName="MediaServiceObjectDetectorVersions" ma:hidden="true" ma:indexed="true" ma:internalName="MediaServiceObjectDetectorVersions" ma:readOnly="true">
+      <xsd:simpleType>
+        <xsd:restriction base="dms:Text"/>
+      </xsd:simpleType>
+    </xsd:element>
+    <xsd:element name="MediaServiceLocation" ma:index="21" nillable="true" ma:displayName="Location" ma:indexed="true" ma:internalName="MediaServiceLocation" ma:readOnly="true">
+      <xsd:simpleType>
+        <xsd:restriction base="dms:Text"/>
+      </xsd:simpleType>
+    </xsd:element>
+    <xsd:element name="MediaServiceSearchProperties" ma:index="22" nillable="true" ma:displayName="MediaServiceSearchProperties" ma:hidden="true" ma:internalName="MediaServiceSearchProperties" ma:readOnly="true">
+      <xsd:simpleType>
+        <xsd:restriction base="dms:Note"/>
+      </xsd:simpleType>
+    </xsd:element>
+  </xsd:schema>
+  <xsd:schema xmlns:xsd="http://www.w3.org/2001/XMLSchema" xmlns:xs="http://www.w3.org/2001/XMLSchema" xmlns:dms="http://schemas.microsoft.com/office/2006/documentManagement/types" xmlns:pc="http://schemas.microsoft.com/office/infopath/2007/PartnerControls" targetNamespace="f1092801-e348-4c00-9058-ba7b1fb55286" elementFormDefault="qualified">
+    <xsd:import namespace="http://schemas.microsoft.com/office/2006/documentManagement/types"/>
+    <xsd:import namespace="http://schemas.microsoft.com/office/infopath/2007/PartnerControls"/>
+    <xsd:element name="TaxCatchAll" ma:index="10" nillable="true" ma:displayName="Taxonomy Catch All Column" ma:hidden="true" ma:list="{54aa5d96-5b2c-44c0-bedd-226bbf9b12e9}" ma:internalName="TaxCatchAll" ma:showField="CatchAllData" ma:web="f1092801-e348-4c00-9058-ba7b1fb55286">
+      <xsd:complexType>
+        <xsd:complexContent>
+          <xsd:extension base="dms:MultiChoiceLookup">
+            <xsd:sequence>
+              <xsd:element name="Value" type="dms:Lookup" maxOccurs="unbounded" minOccurs="0" nillable="true"/>
+            </xsd:sequence>
+          </xsd:extension>
+        </xsd:complexContent>
+      </xsd:complexType>
+    </xsd:element>
+    <xsd:element name="SharedWithUsers" ma:index="18" nillable="true" ma:displayName="Partagé avec" ma:internalName="SharedWithUsers" ma:readOnly="true">
+      <xsd:complexType>
+        <xsd:complexContent>
+          <xsd:extension base="dms:UserMulti">
+            <xsd:sequence>
+              <xsd:element name="UserInfo" minOccurs="0" maxOccurs="unbounded">
+                <xsd:complexType>
+                  <xsd:sequence>
+                    <xsd:element name="DisplayName" type="xsd:string" minOccurs="0"/>
+                    <xsd:element name="AccountId" type="dms:UserId" minOccurs="0" nillable="true"/>
+                    <xsd:element name="AccountType" type="xsd:string" minOccurs="0"/>
+                  </xsd:sequence>
+                </xsd:complexType>
+              </xsd:element>
+            </xsd:sequence>
+          </xsd:extension>
+        </xsd:complexContent>
+      </xsd:complexType>
+    </xsd:element>
+    <xsd:element name="SharedWithDetails" ma:index="19" nillable="true" ma:displayName="Partagé avec détails" ma:internalName="SharedWithDetails" ma:readOnly="true">
+      <xsd:simpleType>
+        <xsd:restriction base="dms:Note">
+          <xsd:maxLength value="255"/>
+        </xsd:restriction>
+      </xsd:simpleType>
+    </xsd:element>
+  </xsd:schema>
+  <xsd:schema xmlns="http://schemas.openxmlformats.org/package/2006/metadata/core-properties" xmlns:xsd="http://www.w3.org/2001/XMLSchema" xmlns:xsi="http://www.w3.org/2001/XMLSchema-instance" xmlns:dc="http://purl.org/dc/elements/1.1/" xmlns:dcterms="http://purl.org/dc/terms/" xmlns:odoc="http://schemas.microsoft.com/internal/obd" targetNamespace="http://schemas.openxmlformats.org/package/2006/metadata/core-properties" elementFormDefault="qualified" attributeFormDefault="unqualified" blockDefault="#all">
+    <xsd:import namespace="http://purl.org/dc/elements/1.1/" schemaLocation="http://dublincore.org/schemas/xmls/qdc/2003/04/02/dc.xsd"/>
+    <xsd:import namespace="http://purl.org/dc/terms/" schemaLocation="http://dublincore.org/schemas/xmls/qdc/2003/04/02/dcterms.xsd"/>
+    <xsd:element name="coreProperties" type="CT_coreProperties"/>
+    <xsd:complexType name="CT_coreProperties">
+      <xsd:all>
+        <xsd:element ref="dc:creator" minOccurs="0" maxOccurs="1"/>
+        <xsd:element ref="dcterms:created" minOccurs="0" maxOccurs="1"/>
+        <xsd:element ref="dc:identifier" minOccurs="0" maxOccurs="1"/>
+        <xsd:element name="contentType" minOccurs="0" maxOccurs="1" type="xsd:string" ma:index="0" ma:displayName="Type de contenu"/>
+        <xsd:element ref="dc:title" minOccurs="0" maxOccurs="1" ma:index="4" ma:displayName="Titre"/>
+        <xsd:element ref="dc:subject" minOccurs="0" maxOccurs="1"/>
+        <xsd:element ref="dc:description" minOccurs="0" maxOccurs="1"/>
+        <xsd:element name="keywords" minOccurs="0" maxOccurs="1" type="xsd:string"/>
+        <xsd:element ref="dc:language" minOccurs="0" maxOccurs="1"/>
+        <xsd:element name="category" minOccurs="0" maxOccurs="1" type="xsd:string"/>
+        <xsd:element name="version" minOccurs="0" maxOccurs="1" type="xsd:string"/>
+        <xsd:element name="revision" minOccurs="0" maxOccurs="1" type="xsd:string">
+          <xsd:annotation>
+            <xsd:documentation>
+                        This value indicates the number of saves or revisions. The application is responsible for updating this value after each revision.
+                    </xsd:documentation>
+          </xsd:annotation>
+        </xsd:element>
+        <xsd:element name="lastModifiedBy" minOccurs="0" maxOccurs="1" type="xsd:string"/>
+        <xsd:element ref="dcterms:modified" minOccurs="0" maxOccurs="1"/>
+        <xsd:element name="contentStatus" minOccurs="0" maxOccurs="1" type="xsd:string"/>
+      </xsd:all>
+    </xsd:complexType>
+  </xsd:schema>
+  <xs:schema xmlns:pc="http://schemas.microsoft.com/office/infopath/2007/PartnerControls" xmlns:xs="http://www.w3.org/2001/XMLSchema" targetNamespace="http://schemas.microsoft.com/office/infopath/2007/PartnerControls" elementFormDefault="qualified" attributeFormDefault="unqualified">
+    <xs:element name="Person">
+      <xs:complexType>
+        <xs:sequence>
+          <xs:element ref="pc:DisplayName" minOccurs="0"/>
+          <xs:element ref="pc:AccountId" minOccurs="0"/>
+          <xs:element ref="pc:AccountType" minOccurs="0"/>
+        </xs:sequence>
+      </xs:complexType>
+    </xs:element>
+    <xs:element name="DisplayName" type="xs:string"/>
+    <xs:element name="AccountId" type="xs:string"/>
+    <xs:element name="AccountType" type="xs:string"/>
+    <xs:element name="BDCAssociatedEntity">
+      <xs:complexType>
+        <xs:sequence>
+          <xs:element ref="pc:BDCEntity" minOccurs="0" maxOccurs="unbounded"/>
+        </xs:sequence>
+        <xs:attribute ref="pc:EntityNamespace"/>
+        <xs:attribute ref="pc:EntityName"/>
+        <xs:attribute ref="pc:SystemInstanceName"/>
+        <xs:attribute ref="pc:AssociationName"/>
+      </xs:complexType>
+    </xs:element>
+    <xs:attribute name="EntityNamespace" type="xs:string"/>
+    <xs:attribute name="EntityName" type="xs:string"/>
+    <xs:attribute name="SystemInstanceName" type="xs:string"/>
+    <xs:attribute name="AssociationName" type="xs:string"/>
+    <xs:element name="BDCEntity">
+      <xs:complexType>
+        <xs:sequence>
+          <xs:element ref="pc:EntityDisplayName" minOccurs="0"/>
+          <xs:element ref="pc:EntityInstanceReference" minOccurs="0"/>
+          <xs:element ref="pc:EntityId1" minOccurs="0"/>
+          <xs:element ref="pc:EntityId2" minOccurs="0"/>
+          <xs:element ref="pc:EntityId3" minOccurs="0"/>
+          <xs:element ref="pc:EntityId4" minOccurs="0"/>
+          <xs:element ref="pc:EntityId5" minOccurs="0"/>
+        </xs:sequence>
+      </xs:complexType>
+    </xs:element>
+    <xs:element name="EntityDisplayName" type="xs:string"/>
+    <xs:element name="EntityInstanceReference" type="xs:string"/>
+    <xs:element name="EntityId1" type="xs:string"/>
+    <xs:element name="EntityId2" type="xs:string"/>
+    <xs:element name="EntityId3" type="xs:string"/>
+    <xs:element name="EntityId4" type="xs:string"/>
+    <xs:element name="EntityId5" type="xs:string"/>
+    <xs:element name="Terms">
+      <xs:complexType>
+        <xs:sequence>
+          <xs:element ref="pc:TermInfo" minOccurs="0" maxOccurs="unbounded"/>
+        </xs:sequence>
+      </xs:complexType>
+    </xs:element>
+    <xs:element name="TermInfo">
+      <xs:complexType>
+        <xs:sequence>
+          <xs:element ref="pc:TermName" minOccurs="0"/>
+          <xs:element ref="pc:TermId" minOccurs="0"/>
+        </xs:sequence>
+      </xs:complexType>
+    </xs:element>
+    <xs:element name="TermName" type="xs:string"/>
+    <xs:element name="TermId" type="xs:string"/>
+  </xs:schema>
+</ct:contentTypeSchema>
+</file>
+
+<file path=customXml/item2.xml><?xml version="1.0" encoding="utf-8"?>
+<?mso-contentType ?>
+<FormTemplates xmlns="http://schemas.microsoft.com/sharepoint/v3/contenttype/forms">
+  <Display>DocumentLibraryForm</Display>
+  <Edit>DocumentLibraryForm</Edit>
+  <New>DocumentLibraryForm</New>
+</FormTemplates>
+</file>
+
+<file path=customXml/item3.xml><?xml version="1.0" encoding="utf-8"?>
+<p:properties xmlns:p="http://schemas.microsoft.com/office/2006/metadata/properties" xmlns:xsi="http://www.w3.org/2001/XMLSchema-instance" xmlns:pc="http://schemas.microsoft.com/office/infopath/2007/PartnerControls">
+  <documentManagement>
+    <lcf76f155ced4ddcb4097134ff3c332f xmlns="c510b244-4fa2-452b-9372-08ea733f7cc3">
+      <Terms xmlns="http://schemas.microsoft.com/office/infopath/2007/PartnerControls"/>
+    </lcf76f155ced4ddcb4097134ff3c332f>
+    <TaxCatchAll xmlns="f1092801-e348-4c00-9058-ba7b1fb55286" xsi:nil="true"/>
+  </documentManagement>
+</p:properties>
+</file>
+
+<file path=customXml/itemProps1.xml><?xml version="1.0" encoding="utf-8"?>
+<ds:datastoreItem xmlns:ds="http://schemas.openxmlformats.org/officeDocument/2006/customXml" ds:itemID="{7AE58C6A-06C4-4DB2-B623-EA707EB20794}"/>
+</file>
+
+<file path=customXml/itemProps2.xml><?xml version="1.0" encoding="utf-8"?>
+<ds:datastoreItem xmlns:ds="http://schemas.openxmlformats.org/officeDocument/2006/customXml" ds:itemID="{0268BEEA-19A3-4879-A437-B84E0BC61E4E}"/>
+</file>
+
+<file path=customXml/itemProps3.xml><?xml version="1.0" encoding="utf-8"?>
+<ds:datastoreItem xmlns:ds="http://schemas.openxmlformats.org/officeDocument/2006/customXml" ds:itemID="{F75A09C0-2D4A-469E-BE76-9C02269A814B}"/>
 </file>
</xml_diff>